<commit_message>
Update documents for two-member team, date and Team ID
Fill Date (03 October 2026) and Team ID (SWTID-2026-7859) in every
phase-wise document and add the second team member, Atchayabharath K S,
alongside Arumparithi B (Team Leader): brainstorming ideas, journey map
ownership, sprint backlog owners, communication plan, demo planning and
team involvement. Update the Submitted by section of the project
documentation (screenshots kept intact), add its PDF to the phase
folder, and update the README.

Co-Authored-By: Claude Opus 5.5 <noreply@anthropic.com>
Claude-Session: https://claude.ai/code/session_01XWkySRoDhLqjcy5kKKZFXe
</commit_message>
<xml_diff>
--- a/Phase-wise Documentation/1. Brainstorming & Ideation/Brainstorming & Idea Prioritization.docx
+++ b/Phase-wise Documentation/1. Brainstorming & Ideation/Brainstorming & Idea Prioritization.docx
@@ -60,7 +60,9 @@
             </w:tcBorders>
           </w:tcPr>
           <w:p>
-            <w:r/>
+            <w:r>
+              <w:t>03 October 2026</w:t>
+            </w:r>
           </w:p>
         </w:tc>
       </w:tr>
@@ -97,7 +99,7 @@
           </w:tcPr>
           <w:p>
             <w:r>
-              <w:t>xxxxxx</w:t>
+              <w:t>SWTID-2026-7859</w:t>
             </w:r>
           </w:p>
         </w:tc>
@@ -205,7 +207,7 @@
         <w:rPr>
           <w:i w:val="0"/>
         </w:rPr>
-        <w:t>Each team member lists out as many ideas as possible without judging them at this stage. (This is a single-member team, so all ideas were generated by Arumparithi B.)</w:t>
+        <w:t>Each team member lists out as many ideas as possible without judging them at this stage. (Team members: Arumparithi B (Team Leader) and Atchayabharath K S.)</w:t>
       </w:r>
     </w:p>
     <w:tbl>
@@ -437,7 +439,7 @@
               <w:rPr>
                 <w:sz w:val="20"/>
               </w:rPr>
-              <w:t>Arumparithi B</w:t>
+              <w:t>Atchayabharath K S</w:t>
             </w:r>
           </w:p>
         </w:tc>
@@ -621,7 +623,7 @@
               <w:rPr>
                 <w:sz w:val="20"/>
               </w:rPr>
-              <w:t>Arumparithi B</w:t>
+              <w:t>Atchayabharath K S</w:t>
             </w:r>
           </w:p>
         </w:tc>
@@ -805,7 +807,7 @@
               <w:rPr>
                 <w:sz w:val="20"/>
               </w:rPr>
-              <w:t>Arumparithi B</w:t>
+              <w:t>Atchayabharath K S</w:t>
             </w:r>
           </w:p>
         </w:tc>

</xml_diff>